<commit_message>
doc: update Egoola Rebuild Phase Tracker with completed tasks and new API details
</commit_message>
<xml_diff>
--- a/Egoola Rebuild Phase Tracker.docx
+++ b/Egoola Rebuild Phase Tracker.docx
@@ -8927,15 +8927,7 @@
                 <w:sz w:val="20"/>
                 <w:szCs w:val="20"/>
               </w:rPr>
-              <w:t xml:space="preserve">After ensuring JSONB feature every JSON data model </w:t>
-            </w:r>
-            <w:r>
-              <w:rPr>
-                <w:color w:val="000000"/>
-                <w:sz w:val="20"/>
-                <w:szCs w:val="20"/>
-              </w:rPr>
-              <w:t>add GIN indexes to those fields, to keep querying and filtering fast.</w:t>
+              <w:t>After ensuring JSONB feature every JSON data model add GIN indexes to those fields, to keep querying and filtering fast.</w:t>
             </w:r>
           </w:p>
         </w:tc>
@@ -12330,10 +12322,10 @@
         <w:tblLook w:val="0000" w:firstRow="0" w:lastRow="0" w:firstColumn="0" w:lastColumn="0" w:noHBand="0" w:noVBand="0"/>
       </w:tblPr>
       <w:tblGrid>
-        <w:gridCol w:w="400"/>
-        <w:gridCol w:w="5760"/>
-        <w:gridCol w:w="1700"/>
-        <w:gridCol w:w="1500"/>
+        <w:gridCol w:w="519"/>
+        <w:gridCol w:w="5658"/>
+        <w:gridCol w:w="1692"/>
+        <w:gridCol w:w="1491"/>
       </w:tblGrid>
       <w:tr>
         <w:trPr>
@@ -12341,7 +12333,7 @@
         </w:trPr>
         <w:tc>
           <w:tcPr>
-            <w:tcW w:w="400" w:type="dxa"/>
+            <w:tcW w:w="464" w:type="dxa"/>
             <w:shd w:val="clear" w:color="auto" w:fill="1F3864"/>
             <w:tcMar>
               <w:top w:w="100" w:type="dxa"/>
@@ -12369,7 +12361,7 @@
         </w:tc>
         <w:tc>
           <w:tcPr>
-            <w:tcW w:w="5760" w:type="dxa"/>
+            <w:tcW w:w="5708" w:type="dxa"/>
             <w:shd w:val="clear" w:color="auto" w:fill="1F3864"/>
             <w:tcMar>
               <w:top w:w="100" w:type="dxa"/>
@@ -12397,7 +12389,7 @@
         </w:tc>
         <w:tc>
           <w:tcPr>
-            <w:tcW w:w="1700" w:type="dxa"/>
+            <w:tcW w:w="1693" w:type="dxa"/>
             <w:shd w:val="clear" w:color="auto" w:fill="1F3864"/>
             <w:tcMar>
               <w:top w:w="100" w:type="dxa"/>
@@ -12425,7 +12417,7 @@
         </w:tc>
         <w:tc>
           <w:tcPr>
-            <w:tcW w:w="1500" w:type="dxa"/>
+            <w:tcW w:w="1495" w:type="dxa"/>
             <w:shd w:val="clear" w:color="auto" w:fill="1F3864"/>
             <w:tcMar>
               <w:top w:w="100" w:type="dxa"/>
@@ -12455,7 +12447,7 @@
       <w:tr>
         <w:tc>
           <w:tcPr>
-            <w:tcW w:w="400" w:type="dxa"/>
+            <w:tcW w:w="464" w:type="dxa"/>
             <w:tcMar>
               <w:top w:w="100" w:type="dxa"/>
               <w:left w:w="120" w:type="dxa"/>
@@ -12480,7 +12472,7 @@
         </w:tc>
         <w:tc>
           <w:tcPr>
-            <w:tcW w:w="5760" w:type="dxa"/>
+            <w:tcW w:w="5708" w:type="dxa"/>
             <w:tcMar>
               <w:top w:w="100" w:type="dxa"/>
               <w:left w:w="120" w:type="dxa"/>
@@ -12505,24 +12497,24 @@
         </w:tc>
         <w:tc>
           <w:tcPr>
-            <w:tcW w:w="1700" w:type="dxa"/>
-            <w:tcMar>
-              <w:top w:w="100" w:type="dxa"/>
-              <w:left w:w="120" w:type="dxa"/>
-              <w:bottom w:w="100" w:type="dxa"/>
-              <w:right w:w="120" w:type="dxa"/>
-            </w:tcMar>
-            <w:vAlign w:val="center"/>
-          </w:tcPr>
-          <w:p>
-            <w:pPr>
-              <w:spacing w:line="260" w:lineRule="auto"/>
-            </w:pPr>
-          </w:p>
-        </w:tc>
-        <w:tc>
-          <w:tcPr>
-            <w:tcW w:w="1500" w:type="dxa"/>
+            <w:tcW w:w="1693" w:type="dxa"/>
+            <w:tcMar>
+              <w:top w:w="100" w:type="dxa"/>
+              <w:left w:w="120" w:type="dxa"/>
+              <w:bottom w:w="100" w:type="dxa"/>
+              <w:right w:w="120" w:type="dxa"/>
+            </w:tcMar>
+            <w:vAlign w:val="center"/>
+          </w:tcPr>
+          <w:p>
+            <w:pPr>
+              <w:spacing w:line="260" w:lineRule="auto"/>
+            </w:pPr>
+          </w:p>
+        </w:tc>
+        <w:tc>
+          <w:tcPr>
+            <w:tcW w:w="1495" w:type="dxa"/>
             <w:tcMar>
               <w:top w:w="100" w:type="dxa"/>
               <w:left w:w="120" w:type="dxa"/>
@@ -12549,7 +12541,7 @@
       <w:tr>
         <w:tc>
           <w:tcPr>
-            <w:tcW w:w="400" w:type="dxa"/>
+            <w:tcW w:w="464" w:type="dxa"/>
             <w:shd w:val="clear" w:color="auto" w:fill="F7F7F7"/>
             <w:tcMar>
               <w:top w:w="100" w:type="dxa"/>
@@ -12575,7 +12567,7 @@
         </w:tc>
         <w:tc>
           <w:tcPr>
-            <w:tcW w:w="5760" w:type="dxa"/>
+            <w:tcW w:w="5708" w:type="dxa"/>
             <w:shd w:val="clear" w:color="auto" w:fill="F7F7F7"/>
             <w:tcMar>
               <w:top w:w="100" w:type="dxa"/>
@@ -12609,25 +12601,25 @@
         </w:tc>
         <w:tc>
           <w:tcPr>
-            <w:tcW w:w="1700" w:type="dxa"/>
-            <w:shd w:val="clear" w:color="auto" w:fill="F7F7F7"/>
-            <w:tcMar>
-              <w:top w:w="100" w:type="dxa"/>
-              <w:left w:w="120" w:type="dxa"/>
-              <w:bottom w:w="100" w:type="dxa"/>
-              <w:right w:w="120" w:type="dxa"/>
-            </w:tcMar>
-            <w:vAlign w:val="center"/>
-          </w:tcPr>
-          <w:p>
-            <w:pPr>
-              <w:spacing w:line="260" w:lineRule="auto"/>
-            </w:pPr>
-          </w:p>
-        </w:tc>
-        <w:tc>
-          <w:tcPr>
-            <w:tcW w:w="1500" w:type="dxa"/>
+            <w:tcW w:w="1693" w:type="dxa"/>
+            <w:shd w:val="clear" w:color="auto" w:fill="F7F7F7"/>
+            <w:tcMar>
+              <w:top w:w="100" w:type="dxa"/>
+              <w:left w:w="120" w:type="dxa"/>
+              <w:bottom w:w="100" w:type="dxa"/>
+              <w:right w:w="120" w:type="dxa"/>
+            </w:tcMar>
+            <w:vAlign w:val="center"/>
+          </w:tcPr>
+          <w:p>
+            <w:pPr>
+              <w:spacing w:line="260" w:lineRule="auto"/>
+            </w:pPr>
+          </w:p>
+        </w:tc>
+        <w:tc>
+          <w:tcPr>
+            <w:tcW w:w="1495" w:type="dxa"/>
             <w:shd w:val="clear" w:color="auto" w:fill="F7F7F7"/>
             <w:tcMar>
               <w:top w:w="100" w:type="dxa"/>
@@ -12655,7 +12647,7 @@
       <w:tr>
         <w:tc>
           <w:tcPr>
-            <w:tcW w:w="400" w:type="dxa"/>
+            <w:tcW w:w="464" w:type="dxa"/>
             <w:shd w:val="clear" w:color="auto" w:fill="F7F7F7"/>
             <w:tcMar>
               <w:top w:w="100" w:type="dxa"/>
@@ -12686,89 +12678,81 @@
         </w:tc>
         <w:tc>
           <w:tcPr>
-            <w:tcW w:w="5760" w:type="dxa"/>
-            <w:shd w:val="clear" w:color="auto" w:fill="F7F7F7"/>
-            <w:tcMar>
-              <w:top w:w="100" w:type="dxa"/>
-              <w:left w:w="120" w:type="dxa"/>
-              <w:bottom w:w="100" w:type="dxa"/>
-              <w:right w:w="120" w:type="dxa"/>
-            </w:tcMar>
-            <w:vAlign w:val="center"/>
-          </w:tcPr>
-          <w:p>
-            <w:pPr>
-              <w:spacing w:line="260" w:lineRule="auto"/>
-              <w:rPr>
-                <w:color w:val="000000"/>
-                <w:sz w:val="20"/>
-                <w:szCs w:val="20"/>
-              </w:rPr>
-            </w:pPr>
-            <w:r>
-              <w:rPr>
-                <w:color w:val="000000"/>
-                <w:sz w:val="20"/>
-                <w:szCs w:val="20"/>
-              </w:rPr>
-              <w:t>S</w:t>
-            </w:r>
-            <w:r>
-              <w:rPr>
-                <w:color w:val="000000"/>
-                <w:sz w:val="20"/>
-                <w:szCs w:val="20"/>
-              </w:rPr>
-              <w:t>eller verification — reviewing and approving new seller sign-ups.</w:t>
-            </w:r>
-          </w:p>
-        </w:tc>
-        <w:tc>
-          <w:tcPr>
-            <w:tcW w:w="1700" w:type="dxa"/>
-            <w:shd w:val="clear" w:color="auto" w:fill="F7F7F7"/>
-            <w:tcMar>
-              <w:top w:w="100" w:type="dxa"/>
-              <w:left w:w="120" w:type="dxa"/>
-              <w:bottom w:w="100" w:type="dxa"/>
-              <w:right w:w="120" w:type="dxa"/>
-            </w:tcMar>
-            <w:vAlign w:val="center"/>
-          </w:tcPr>
-          <w:p>
-            <w:pPr>
-              <w:spacing w:line="260" w:lineRule="auto"/>
-            </w:pPr>
-          </w:p>
-        </w:tc>
-        <w:tc>
-          <w:tcPr>
-            <w:tcW w:w="1500" w:type="dxa"/>
-            <w:shd w:val="clear" w:color="auto" w:fill="F7F7F7"/>
-            <w:tcMar>
-              <w:top w:w="100" w:type="dxa"/>
-              <w:left w:w="120" w:type="dxa"/>
-              <w:bottom w:w="100" w:type="dxa"/>
-              <w:right w:w="120" w:type="dxa"/>
-            </w:tcMar>
-            <w:vAlign w:val="center"/>
-          </w:tcPr>
-          <w:p>
-            <w:pPr>
-              <w:spacing w:line="260" w:lineRule="auto"/>
-              <w:rPr>
-                <w:color w:val="000000"/>
-                <w:sz w:val="20"/>
-                <w:szCs w:val="20"/>
-              </w:rPr>
-            </w:pPr>
-            <w:r>
-              <w:rPr>
-                <w:color w:val="000000"/>
-                <w:sz w:val="20"/>
-                <w:szCs w:val="20"/>
-              </w:rPr>
-              <w:t>Not Started</w:t>
+            <w:tcW w:w="5708" w:type="dxa"/>
+            <w:shd w:val="clear" w:color="auto" w:fill="F7F7F7"/>
+            <w:tcMar>
+              <w:top w:w="100" w:type="dxa"/>
+              <w:left w:w="120" w:type="dxa"/>
+              <w:bottom w:w="100" w:type="dxa"/>
+              <w:right w:w="120" w:type="dxa"/>
+            </w:tcMar>
+            <w:vAlign w:val="center"/>
+          </w:tcPr>
+          <w:p>
+            <w:pPr>
+              <w:spacing w:line="260" w:lineRule="auto"/>
+              <w:rPr>
+                <w:color w:val="000000"/>
+                <w:sz w:val="20"/>
+                <w:szCs w:val="20"/>
+              </w:rPr>
+            </w:pPr>
+            <w:r>
+              <w:rPr>
+                <w:color w:val="000000"/>
+                <w:sz w:val="20"/>
+                <w:szCs w:val="20"/>
+              </w:rPr>
+              <w:t>Seller verification — reviewing and approving new seller sign-ups.</w:t>
+            </w:r>
+          </w:p>
+        </w:tc>
+        <w:tc>
+          <w:tcPr>
+            <w:tcW w:w="1693" w:type="dxa"/>
+            <w:shd w:val="clear" w:color="auto" w:fill="F7F7F7"/>
+            <w:tcMar>
+              <w:top w:w="100" w:type="dxa"/>
+              <w:left w:w="120" w:type="dxa"/>
+              <w:bottom w:w="100" w:type="dxa"/>
+              <w:right w:w="120" w:type="dxa"/>
+            </w:tcMar>
+            <w:vAlign w:val="center"/>
+          </w:tcPr>
+          <w:p>
+            <w:pPr>
+              <w:spacing w:line="260" w:lineRule="auto"/>
+            </w:pPr>
+          </w:p>
+        </w:tc>
+        <w:tc>
+          <w:tcPr>
+            <w:tcW w:w="1495" w:type="dxa"/>
+            <w:shd w:val="clear" w:color="auto" w:fill="F7F7F7"/>
+            <w:tcMar>
+              <w:top w:w="100" w:type="dxa"/>
+              <w:left w:w="120" w:type="dxa"/>
+              <w:bottom w:w="100" w:type="dxa"/>
+              <w:right w:w="120" w:type="dxa"/>
+            </w:tcMar>
+            <w:vAlign w:val="center"/>
+          </w:tcPr>
+          <w:p>
+            <w:pPr>
+              <w:spacing w:line="260" w:lineRule="auto"/>
+              <w:rPr>
+                <w:color w:val="000000"/>
+                <w:sz w:val="20"/>
+                <w:szCs w:val="20"/>
+              </w:rPr>
+            </w:pPr>
+            <w:r>
+              <w:rPr>
+                <w:color w:val="000000"/>
+                <w:sz w:val="20"/>
+                <w:szCs w:val="20"/>
+              </w:rPr>
+              <w:t>Completed</w:t>
             </w:r>
           </w:p>
         </w:tc>
@@ -12776,32 +12760,27 @@
       <w:tr>
         <w:tc>
           <w:tcPr>
-            <w:tcW w:w="400" w:type="dxa"/>
-            <w:tcMar>
-              <w:top w:w="100" w:type="dxa"/>
-              <w:left w:w="120" w:type="dxa"/>
-              <w:bottom w:w="100" w:type="dxa"/>
-              <w:right w:w="120" w:type="dxa"/>
-            </w:tcMar>
-            <w:vAlign w:val="center"/>
-          </w:tcPr>
-          <w:p>
-            <w:pPr>
-              <w:spacing w:line="260" w:lineRule="auto"/>
-            </w:pPr>
-            <w:r>
-              <w:rPr>
-                <w:color w:val="000000"/>
-                <w:sz w:val="20"/>
-                <w:szCs w:val="20"/>
-              </w:rPr>
-              <w:t>3</w:t>
-            </w:r>
-          </w:p>
-        </w:tc>
-        <w:tc>
-          <w:tcPr>
-            <w:tcW w:w="5760" w:type="dxa"/>
+            <w:tcW w:w="464" w:type="dxa"/>
+            <w:tcMar>
+              <w:top w:w="100" w:type="dxa"/>
+              <w:left w:w="120" w:type="dxa"/>
+              <w:bottom w:w="100" w:type="dxa"/>
+              <w:right w:w="120" w:type="dxa"/>
+            </w:tcMar>
+            <w:vAlign w:val="center"/>
+          </w:tcPr>
+          <w:p>
+            <w:pPr>
+              <w:spacing w:line="260" w:lineRule="auto"/>
+            </w:pPr>
+            <w:r>
+              <w:t>4</w:t>
+            </w:r>
+          </w:p>
+        </w:tc>
+        <w:tc>
+          <w:tcPr>
+            <w:tcW w:w="5708" w:type="dxa"/>
             <w:tcMar>
               <w:top w:w="100" w:type="dxa"/>
               <w:left w:w="120" w:type="dxa"/>
@@ -12826,43 +12805,43 @@
         </w:tc>
         <w:tc>
           <w:tcPr>
-            <w:tcW w:w="1700" w:type="dxa"/>
-            <w:tcMar>
-              <w:top w:w="100" w:type="dxa"/>
-              <w:left w:w="120" w:type="dxa"/>
-              <w:bottom w:w="100" w:type="dxa"/>
-              <w:right w:w="120" w:type="dxa"/>
-            </w:tcMar>
-            <w:vAlign w:val="center"/>
-          </w:tcPr>
-          <w:p>
-            <w:pPr>
-              <w:spacing w:line="260" w:lineRule="auto"/>
-            </w:pPr>
-          </w:p>
-        </w:tc>
-        <w:tc>
-          <w:tcPr>
-            <w:tcW w:w="1500" w:type="dxa"/>
-            <w:tcMar>
-              <w:top w:w="100" w:type="dxa"/>
-              <w:left w:w="120" w:type="dxa"/>
-              <w:bottom w:w="100" w:type="dxa"/>
-              <w:right w:w="120" w:type="dxa"/>
-            </w:tcMar>
-            <w:vAlign w:val="center"/>
-          </w:tcPr>
-          <w:p>
-            <w:pPr>
-              <w:spacing w:line="260" w:lineRule="auto"/>
-            </w:pPr>
-            <w:r>
-              <w:rPr>
-                <w:color w:val="000000"/>
-                <w:sz w:val="20"/>
-                <w:szCs w:val="20"/>
-              </w:rPr>
-              <w:t>Not started</w:t>
+            <w:tcW w:w="1693" w:type="dxa"/>
+            <w:tcMar>
+              <w:top w:w="100" w:type="dxa"/>
+              <w:left w:w="120" w:type="dxa"/>
+              <w:bottom w:w="100" w:type="dxa"/>
+              <w:right w:w="120" w:type="dxa"/>
+            </w:tcMar>
+            <w:vAlign w:val="center"/>
+          </w:tcPr>
+          <w:p>
+            <w:pPr>
+              <w:spacing w:line="260" w:lineRule="auto"/>
+            </w:pPr>
+          </w:p>
+        </w:tc>
+        <w:tc>
+          <w:tcPr>
+            <w:tcW w:w="1495" w:type="dxa"/>
+            <w:tcMar>
+              <w:top w:w="100" w:type="dxa"/>
+              <w:left w:w="120" w:type="dxa"/>
+              <w:bottom w:w="100" w:type="dxa"/>
+              <w:right w:w="120" w:type="dxa"/>
+            </w:tcMar>
+            <w:vAlign w:val="center"/>
+          </w:tcPr>
+          <w:p>
+            <w:pPr>
+              <w:spacing w:line="260" w:lineRule="auto"/>
+            </w:pPr>
+            <w:r>
+              <w:rPr>
+                <w:color w:val="000000"/>
+                <w:sz w:val="20"/>
+                <w:szCs w:val="20"/>
+              </w:rPr>
+              <w:t>Completed</w:t>
             </w:r>
           </w:p>
         </w:tc>
@@ -12870,97 +12849,106 @@
       <w:tr>
         <w:tc>
           <w:tcPr>
-            <w:tcW w:w="400" w:type="dxa"/>
-            <w:shd w:val="clear" w:color="auto" w:fill="F7F7F7"/>
-            <w:tcMar>
-              <w:top w:w="100" w:type="dxa"/>
-              <w:left w:w="120" w:type="dxa"/>
-              <w:bottom w:w="100" w:type="dxa"/>
-              <w:right w:w="120" w:type="dxa"/>
-            </w:tcMar>
-            <w:vAlign w:val="center"/>
-          </w:tcPr>
-          <w:p>
-            <w:pPr>
-              <w:spacing w:line="260" w:lineRule="auto"/>
-            </w:pPr>
-            <w:r>
-              <w:rPr>
-                <w:color w:val="000000"/>
-                <w:sz w:val="20"/>
-                <w:szCs w:val="20"/>
-              </w:rPr>
-              <w:t>4</w:t>
-            </w:r>
-          </w:p>
-        </w:tc>
-        <w:tc>
-          <w:tcPr>
-            <w:tcW w:w="5760" w:type="dxa"/>
-            <w:shd w:val="clear" w:color="auto" w:fill="F7F7F7"/>
-            <w:tcMar>
-              <w:top w:w="100" w:type="dxa"/>
-              <w:left w:w="120" w:type="dxa"/>
-              <w:bottom w:w="100" w:type="dxa"/>
-              <w:right w:w="120" w:type="dxa"/>
-            </w:tcMar>
-            <w:vAlign w:val="center"/>
-          </w:tcPr>
-          <w:p>
-            <w:pPr>
-              <w:spacing w:line="260" w:lineRule="auto"/>
-            </w:pPr>
-            <w:r>
-              <w:rPr>
-                <w:color w:val="000000"/>
-                <w:sz w:val="20"/>
-                <w:szCs w:val="20"/>
-              </w:rPr>
-              <w:t>Build the Buyer/User Management API: create, update, list (with filters), and view details.</w:t>
-            </w:r>
-          </w:p>
-        </w:tc>
-        <w:tc>
-          <w:tcPr>
-            <w:tcW w:w="1700" w:type="dxa"/>
-            <w:shd w:val="clear" w:color="auto" w:fill="F7F7F7"/>
-            <w:tcMar>
-              <w:top w:w="100" w:type="dxa"/>
-              <w:left w:w="120" w:type="dxa"/>
-              <w:bottom w:w="100" w:type="dxa"/>
-              <w:right w:w="120" w:type="dxa"/>
-            </w:tcMar>
-            <w:vAlign w:val="center"/>
-          </w:tcPr>
-          <w:p>
-            <w:pPr>
-              <w:spacing w:line="260" w:lineRule="auto"/>
-            </w:pPr>
-          </w:p>
-        </w:tc>
-        <w:tc>
-          <w:tcPr>
-            <w:tcW w:w="1500" w:type="dxa"/>
-            <w:shd w:val="clear" w:color="auto" w:fill="F7F7F7"/>
-            <w:tcMar>
-              <w:top w:w="100" w:type="dxa"/>
-              <w:left w:w="120" w:type="dxa"/>
-              <w:bottom w:w="100" w:type="dxa"/>
-              <w:right w:w="120" w:type="dxa"/>
-            </w:tcMar>
-            <w:vAlign w:val="center"/>
-          </w:tcPr>
-          <w:p>
-            <w:pPr>
-              <w:spacing w:line="260" w:lineRule="auto"/>
-            </w:pPr>
-            <w:r>
-              <w:rPr>
-                <w:color w:val="000000"/>
-                <w:sz w:val="20"/>
-                <w:szCs w:val="20"/>
-              </w:rPr>
-              <w:t>Not started</w:t>
+            <w:tcW w:w="464" w:type="dxa"/>
+            <w:tcMar>
+              <w:top w:w="100" w:type="dxa"/>
+              <w:left w:w="120" w:type="dxa"/>
+              <w:bottom w:w="100" w:type="dxa"/>
+              <w:right w:w="120" w:type="dxa"/>
+            </w:tcMar>
+            <w:vAlign w:val="center"/>
+          </w:tcPr>
+          <w:p>
+            <w:pPr>
+              <w:spacing w:line="260" w:lineRule="auto"/>
+            </w:pPr>
+            <w:r>
+              <w:t>5</w:t>
+            </w:r>
+          </w:p>
+        </w:tc>
+        <w:tc>
+          <w:tcPr>
+            <w:tcW w:w="5708" w:type="dxa"/>
+            <w:tcMar>
+              <w:top w:w="100" w:type="dxa"/>
+              <w:left w:w="120" w:type="dxa"/>
+              <w:bottom w:w="100" w:type="dxa"/>
+              <w:right w:w="120" w:type="dxa"/>
+            </w:tcMar>
+            <w:vAlign w:val="center"/>
+          </w:tcPr>
+          <w:p>
+            <w:pPr>
+              <w:spacing w:line="260" w:lineRule="auto"/>
+            </w:pPr>
+            <w:r>
+              <w:rPr>
+                <w:color w:val="000000"/>
+                <w:sz w:val="20"/>
+                <w:szCs w:val="20"/>
+              </w:rPr>
+              <w:t xml:space="preserve">Build the Brand Management API under the Listing module — create, update, list (filter by name), and delete — with its own brands table (name, unique slug, isActive, creator details). Listings now pick their brand from this list instead of typing it, and a brand listing must have one. Also in this step: a listing's seller/buyer became optional (Admin-created listings), and oldPrice was </w:t>
+            </w:r>
+            <w:r>
+              <w:rPr>
+                <w:color w:val="000000"/>
+                <w:sz w:val="20"/>
+                <w:szCs w:val="20"/>
+              </w:rPr>
+              <w:lastRenderedPageBreak/>
+              <w:t>renamed to discountedPrice (price stays the original price) on listings and price tiers.</w:t>
+            </w:r>
+          </w:p>
+        </w:tc>
+        <w:tc>
+          <w:tcPr>
+            <w:tcW w:w="1693" w:type="dxa"/>
+            <w:tcMar>
+              <w:top w:w="100" w:type="dxa"/>
+              <w:left w:w="120" w:type="dxa"/>
+              <w:bottom w:w="100" w:type="dxa"/>
+              <w:right w:w="120" w:type="dxa"/>
+            </w:tcMar>
+            <w:vAlign w:val="center"/>
+          </w:tcPr>
+          <w:p>
+            <w:pPr>
+              <w:spacing w:line="260" w:lineRule="auto"/>
+            </w:pPr>
+            <w:r>
+              <w:lastRenderedPageBreak/>
+              <w:t xml:space="preserve">Brand only at this step. Attributes and listing SKUs were built </w:t>
+            </w:r>
+            <w:r>
+              <w:lastRenderedPageBreak/>
+              <w:t>afterwards (next row).</w:t>
+            </w:r>
+          </w:p>
+        </w:tc>
+        <w:tc>
+          <w:tcPr>
+            <w:tcW w:w="1495" w:type="dxa"/>
+            <w:tcMar>
+              <w:top w:w="100" w:type="dxa"/>
+              <w:left w:w="120" w:type="dxa"/>
+              <w:bottom w:w="100" w:type="dxa"/>
+              <w:right w:w="120" w:type="dxa"/>
+            </w:tcMar>
+            <w:vAlign w:val="center"/>
+          </w:tcPr>
+          <w:p>
+            <w:pPr>
+              <w:spacing w:line="260" w:lineRule="auto"/>
+            </w:pPr>
+            <w:r>
+              <w:rPr>
+                <w:color w:val="000000"/>
+                <w:sz w:val="20"/>
+                <w:szCs w:val="20"/>
+              </w:rPr>
+              <w:lastRenderedPageBreak/>
+              <w:t>Completed</w:t>
             </w:r>
           </w:p>
         </w:tc>
@@ -12968,102 +12956,91 @@
       <w:tr>
         <w:tc>
           <w:tcPr>
-            <w:tcW w:w="400" w:type="dxa"/>
-            <w:tcMar>
-              <w:top w:w="100" w:type="dxa"/>
-              <w:left w:w="120" w:type="dxa"/>
-              <w:bottom w:w="100" w:type="dxa"/>
-              <w:right w:w="120" w:type="dxa"/>
-            </w:tcMar>
-            <w:vAlign w:val="center"/>
-          </w:tcPr>
-          <w:p>
-            <w:pPr>
-              <w:spacing w:line="260" w:lineRule="auto"/>
-            </w:pPr>
-            <w:r>
-              <w:rPr>
-                <w:color w:val="000000"/>
-                <w:sz w:val="20"/>
-                <w:szCs w:val="20"/>
-              </w:rPr>
-              <w:t>5</w:t>
-            </w:r>
-          </w:p>
-        </w:tc>
-        <w:tc>
-          <w:tcPr>
-            <w:tcW w:w="5760" w:type="dxa"/>
-            <w:tcMar>
-              <w:top w:w="100" w:type="dxa"/>
-              <w:left w:w="120" w:type="dxa"/>
-              <w:bottom w:w="100" w:type="dxa"/>
-              <w:right w:w="120" w:type="dxa"/>
-            </w:tcMar>
-            <w:vAlign w:val="center"/>
-          </w:tcPr>
-          <w:p>
-            <w:pPr>
-              <w:spacing w:line="260" w:lineRule="auto"/>
-            </w:pPr>
-            <w:r>
-              <w:rPr>
-                <w:color w:val="000000"/>
-                <w:sz w:val="20"/>
-                <w:szCs w:val="20"/>
-              </w:rPr>
-              <w:t xml:space="preserve">Build the Admin Management API: an admin can create, update, list, and view details for other admins. Keep the two admin roles — </w:t>
-            </w:r>
-            <w:r>
-              <w:rPr>
-                <w:color w:val="000000"/>
-                <w:sz w:val="20"/>
-                <w:szCs w:val="20"/>
-              </w:rPr>
-              <w:lastRenderedPageBreak/>
-              <w:t>super-admin and admin — and only allow super-admins to use Admin Management.</w:t>
-            </w:r>
-          </w:p>
-        </w:tc>
-        <w:tc>
-          <w:tcPr>
-            <w:tcW w:w="1700" w:type="dxa"/>
-            <w:tcMar>
-              <w:top w:w="100" w:type="dxa"/>
-              <w:left w:w="120" w:type="dxa"/>
-              <w:bottom w:w="100" w:type="dxa"/>
-              <w:right w:w="120" w:type="dxa"/>
-            </w:tcMar>
-            <w:vAlign w:val="center"/>
-          </w:tcPr>
-          <w:p>
-            <w:pPr>
-              <w:spacing w:line="260" w:lineRule="auto"/>
-            </w:pPr>
-          </w:p>
-        </w:tc>
-        <w:tc>
-          <w:tcPr>
-            <w:tcW w:w="1500" w:type="dxa"/>
-            <w:tcMar>
-              <w:top w:w="100" w:type="dxa"/>
-              <w:left w:w="120" w:type="dxa"/>
-              <w:bottom w:w="100" w:type="dxa"/>
-              <w:right w:w="120" w:type="dxa"/>
-            </w:tcMar>
-            <w:vAlign w:val="center"/>
-          </w:tcPr>
-          <w:p>
-            <w:pPr>
-              <w:spacing w:line="260" w:lineRule="auto"/>
-            </w:pPr>
-            <w:r>
-              <w:rPr>
-                <w:color w:val="000000"/>
-                <w:sz w:val="20"/>
-                <w:szCs w:val="20"/>
-              </w:rPr>
-              <w:t>Not started</w:t>
+            <w:tcW w:w="464" w:type="dxa"/>
+            <w:tcMar>
+              <w:top w:w="100" w:type="dxa"/>
+              <w:left w:w="120" w:type="dxa"/>
+              <w:bottom w:w="100" w:type="dxa"/>
+              <w:right w:w="120" w:type="dxa"/>
+            </w:tcMar>
+            <w:vAlign w:val="center"/>
+          </w:tcPr>
+          <w:p>
+            <w:pPr>
+              <w:spacing w:line="260" w:lineRule="auto"/>
+            </w:pPr>
+            <w:r>
+              <w:t>5.1</w:t>
+            </w:r>
+          </w:p>
+        </w:tc>
+        <w:tc>
+          <w:tcPr>
+            <w:tcW w:w="5708" w:type="dxa"/>
+            <w:tcMar>
+              <w:top w:w="100" w:type="dxa"/>
+              <w:left w:w="120" w:type="dxa"/>
+              <w:bottom w:w="100" w:type="dxa"/>
+              <w:right w:w="120" w:type="dxa"/>
+            </w:tcMar>
+            <w:vAlign w:val="center"/>
+          </w:tcPr>
+          <w:p>
+            <w:pPr>
+              <w:spacing w:line="260" w:lineRule="auto"/>
+            </w:pPr>
+            <w:r>
+              <w:rPr>
+                <w:color w:val="000000"/>
+                <w:sz w:val="20"/>
+                <w:szCs w:val="20"/>
+              </w:rPr>
+              <w:t>Attributes, attribute values and listing SKUs: Size / Colour options, one SKU per combination with its own price, discount window and stock.</w:t>
+            </w:r>
+          </w:p>
+        </w:tc>
+        <w:tc>
+          <w:tcPr>
+            <w:tcW w:w="1693" w:type="dxa"/>
+            <w:tcMar>
+              <w:top w:w="100" w:type="dxa"/>
+              <w:left w:w="120" w:type="dxa"/>
+              <w:bottom w:w="100" w:type="dxa"/>
+              <w:right w:w="120" w:type="dxa"/>
+            </w:tcMar>
+            <w:vAlign w:val="center"/>
+          </w:tcPr>
+          <w:p>
+            <w:pPr>
+              <w:spacing w:line="260" w:lineRule="auto"/>
+            </w:pPr>
+            <w:r>
+              <w:t>Attribute and value CRUD (English + optional Bangla); SKUs and variants inside the Listing API (update by id, SKUs are hidden not deleted); price, discount and stock moved off listings. Guide: docs/attribute-sku-guide.md. Postman: Egoola-Attribute.</w:t>
+            </w:r>
+          </w:p>
+        </w:tc>
+        <w:tc>
+          <w:tcPr>
+            <w:tcW w:w="1495" w:type="dxa"/>
+            <w:tcMar>
+              <w:top w:w="100" w:type="dxa"/>
+              <w:left w:w="120" w:type="dxa"/>
+              <w:bottom w:w="100" w:type="dxa"/>
+              <w:right w:w="120" w:type="dxa"/>
+            </w:tcMar>
+            <w:vAlign w:val="center"/>
+          </w:tcPr>
+          <w:p>
+            <w:pPr>
+              <w:spacing w:line="260" w:lineRule="auto"/>
+            </w:pPr>
+            <w:r>
+              <w:rPr>
+                <w:color w:val="000000"/>
+                <w:sz w:val="20"/>
+                <w:szCs w:val="20"/>
+              </w:rPr>
+              <w:t>Completed</w:t>
             </w:r>
           </w:p>
         </w:tc>
@@ -13071,97 +13048,92 @@
       <w:tr>
         <w:tc>
           <w:tcPr>
-            <w:tcW w:w="400" w:type="dxa"/>
-            <w:shd w:val="clear" w:color="auto" w:fill="F7F7F7"/>
-            <w:tcMar>
-              <w:top w:w="100" w:type="dxa"/>
-              <w:left w:w="120" w:type="dxa"/>
-              <w:bottom w:w="100" w:type="dxa"/>
-              <w:right w:w="120" w:type="dxa"/>
-            </w:tcMar>
-            <w:vAlign w:val="center"/>
-          </w:tcPr>
-          <w:p>
-            <w:pPr>
-              <w:spacing w:line="260" w:lineRule="auto"/>
-            </w:pPr>
-            <w:r>
-              <w:rPr>
-                <w:color w:val="000000"/>
-                <w:sz w:val="20"/>
-                <w:szCs w:val="20"/>
-              </w:rPr>
+            <w:tcW w:w="464" w:type="dxa"/>
+            <w:shd w:val="clear" w:color="auto" w:fill="F7F7F7"/>
+            <w:tcMar>
+              <w:top w:w="100" w:type="dxa"/>
+              <w:left w:w="120" w:type="dxa"/>
+              <w:bottom w:w="100" w:type="dxa"/>
+              <w:right w:w="120" w:type="dxa"/>
+            </w:tcMar>
+            <w:vAlign w:val="center"/>
+          </w:tcPr>
+          <w:p>
+            <w:pPr>
+              <w:spacing w:line="260" w:lineRule="auto"/>
+            </w:pPr>
+            <w:r>
               <w:t>6</w:t>
             </w:r>
           </w:p>
         </w:tc>
         <w:tc>
           <w:tcPr>
-            <w:tcW w:w="5760" w:type="dxa"/>
-            <w:shd w:val="clear" w:color="auto" w:fill="F7F7F7"/>
-            <w:tcMar>
-              <w:top w:w="100" w:type="dxa"/>
-              <w:left w:w="120" w:type="dxa"/>
-              <w:bottom w:w="100" w:type="dxa"/>
-              <w:right w:w="120" w:type="dxa"/>
-            </w:tcMar>
-            <w:vAlign w:val="center"/>
-          </w:tcPr>
-          <w:p>
-            <w:pPr>
-              <w:spacing w:line="260" w:lineRule="auto"/>
-            </w:pPr>
-            <w:r>
-              <w:rPr>
-                <w:color w:val="000000"/>
-                <w:sz w:val="20"/>
-                <w:szCs w:val="20"/>
-              </w:rPr>
-              <w:t>Build the financial oversight API: reviewing withdrawal requests, refunds, and commission settings.</w:t>
-            </w:r>
-          </w:p>
-        </w:tc>
-        <w:tc>
-          <w:tcPr>
-            <w:tcW w:w="1700" w:type="dxa"/>
-            <w:shd w:val="clear" w:color="auto" w:fill="F7F7F7"/>
-            <w:tcMar>
-              <w:top w:w="100" w:type="dxa"/>
-              <w:left w:w="120" w:type="dxa"/>
-              <w:bottom w:w="100" w:type="dxa"/>
-              <w:right w:w="120" w:type="dxa"/>
-            </w:tcMar>
-            <w:vAlign w:val="center"/>
-          </w:tcPr>
-          <w:p>
-            <w:pPr>
-              <w:spacing w:line="260" w:lineRule="auto"/>
-            </w:pPr>
-          </w:p>
-        </w:tc>
-        <w:tc>
-          <w:tcPr>
-            <w:tcW w:w="1500" w:type="dxa"/>
-            <w:shd w:val="clear" w:color="auto" w:fill="F7F7F7"/>
-            <w:tcMar>
-              <w:top w:w="100" w:type="dxa"/>
-              <w:left w:w="120" w:type="dxa"/>
-              <w:bottom w:w="100" w:type="dxa"/>
-              <w:right w:w="120" w:type="dxa"/>
-            </w:tcMar>
-            <w:vAlign w:val="center"/>
-          </w:tcPr>
-          <w:p>
-            <w:pPr>
-              <w:spacing w:line="260" w:lineRule="auto"/>
-            </w:pPr>
-            <w:r>
-              <w:rPr>
-                <w:color w:val="000000"/>
-                <w:sz w:val="20"/>
-                <w:szCs w:val="20"/>
-              </w:rPr>
-              <w:t>Not started</w:t>
+            <w:tcW w:w="5708" w:type="dxa"/>
+            <w:shd w:val="clear" w:color="auto" w:fill="F7F7F7"/>
+            <w:tcMar>
+              <w:top w:w="100" w:type="dxa"/>
+              <w:left w:w="120" w:type="dxa"/>
+              <w:bottom w:w="100" w:type="dxa"/>
+              <w:right w:w="120" w:type="dxa"/>
+            </w:tcMar>
+            <w:vAlign w:val="center"/>
+          </w:tcPr>
+          <w:p>
+            <w:pPr>
+              <w:spacing w:line="260" w:lineRule="auto"/>
+            </w:pPr>
+            <w:r>
+              <w:rPr>
+                <w:color w:val="000000"/>
+                <w:sz w:val="20"/>
+                <w:szCs w:val="20"/>
+              </w:rPr>
+              <w:t>Build the Buyer/User Management API: create, update, list (with filters), and view details.</w:t>
+            </w:r>
+          </w:p>
+        </w:tc>
+        <w:tc>
+          <w:tcPr>
+            <w:tcW w:w="1693" w:type="dxa"/>
+            <w:shd w:val="clear" w:color="auto" w:fill="F7F7F7"/>
+            <w:tcMar>
+              <w:top w:w="100" w:type="dxa"/>
+              <w:left w:w="120" w:type="dxa"/>
+              <w:bottom w:w="100" w:type="dxa"/>
+              <w:right w:w="120" w:type="dxa"/>
+            </w:tcMar>
+            <w:vAlign w:val="center"/>
+          </w:tcPr>
+          <w:p>
+            <w:pPr>
+              <w:spacing w:line="260" w:lineRule="auto"/>
+            </w:pPr>
+          </w:p>
+        </w:tc>
+        <w:tc>
+          <w:tcPr>
+            <w:tcW w:w="1495" w:type="dxa"/>
+            <w:shd w:val="clear" w:color="auto" w:fill="F7F7F7"/>
+            <w:tcMar>
+              <w:top w:w="100" w:type="dxa"/>
+              <w:left w:w="120" w:type="dxa"/>
+              <w:bottom w:w="100" w:type="dxa"/>
+              <w:right w:w="120" w:type="dxa"/>
+            </w:tcMar>
+            <w:vAlign w:val="center"/>
+          </w:tcPr>
+          <w:p>
+            <w:pPr>
+              <w:spacing w:line="260" w:lineRule="auto"/>
+            </w:pPr>
+            <w:r>
+              <w:rPr>
+                <w:color w:val="000000"/>
+                <w:sz w:val="20"/>
+                <w:szCs w:val="20"/>
+              </w:rPr>
+              <w:t>Completed</w:t>
             </w:r>
           </w:p>
         </w:tc>
@@ -13169,93 +13141,88 @@
       <w:tr>
         <w:tc>
           <w:tcPr>
-            <w:tcW w:w="400" w:type="dxa"/>
-            <w:tcMar>
-              <w:top w:w="100" w:type="dxa"/>
-              <w:left w:w="120" w:type="dxa"/>
-              <w:bottom w:w="100" w:type="dxa"/>
-              <w:right w:w="120" w:type="dxa"/>
-            </w:tcMar>
-            <w:vAlign w:val="center"/>
-          </w:tcPr>
-          <w:p>
-            <w:pPr>
-              <w:spacing w:line="260" w:lineRule="auto"/>
-            </w:pPr>
-            <w:r>
-              <w:rPr>
-                <w:color w:val="000000"/>
-                <w:sz w:val="20"/>
-                <w:szCs w:val="20"/>
-              </w:rPr>
+            <w:tcW w:w="464" w:type="dxa"/>
+            <w:tcMar>
+              <w:top w:w="100" w:type="dxa"/>
+              <w:left w:w="120" w:type="dxa"/>
+              <w:bottom w:w="100" w:type="dxa"/>
+              <w:right w:w="120" w:type="dxa"/>
+            </w:tcMar>
+            <w:vAlign w:val="center"/>
+          </w:tcPr>
+          <w:p>
+            <w:pPr>
+              <w:spacing w:line="260" w:lineRule="auto"/>
+            </w:pPr>
+            <w:r>
               <w:t>7</w:t>
             </w:r>
           </w:p>
         </w:tc>
         <w:tc>
           <w:tcPr>
-            <w:tcW w:w="5760" w:type="dxa"/>
-            <w:tcMar>
-              <w:top w:w="100" w:type="dxa"/>
-              <w:left w:w="120" w:type="dxa"/>
-              <w:bottom w:w="100" w:type="dxa"/>
-              <w:right w:w="120" w:type="dxa"/>
-            </w:tcMar>
-            <w:vAlign w:val="center"/>
-          </w:tcPr>
-          <w:p>
-            <w:pPr>
-              <w:spacing w:line="260" w:lineRule="auto"/>
-            </w:pPr>
-            <w:r>
-              <w:rPr>
-                <w:color w:val="000000"/>
-                <w:sz w:val="20"/>
-                <w:szCs w:val="20"/>
-              </w:rPr>
-              <w:t>Build the site settings and CMS API: banners, email templates, and the site logo.</w:t>
-            </w:r>
-          </w:p>
-        </w:tc>
-        <w:tc>
-          <w:tcPr>
-            <w:tcW w:w="1700" w:type="dxa"/>
-            <w:tcMar>
-              <w:top w:w="100" w:type="dxa"/>
-              <w:left w:w="120" w:type="dxa"/>
-              <w:bottom w:w="100" w:type="dxa"/>
-              <w:right w:w="120" w:type="dxa"/>
-            </w:tcMar>
-            <w:vAlign w:val="center"/>
-          </w:tcPr>
-          <w:p>
-            <w:pPr>
-              <w:spacing w:line="260" w:lineRule="auto"/>
-            </w:pPr>
-          </w:p>
-        </w:tc>
-        <w:tc>
-          <w:tcPr>
-            <w:tcW w:w="1500" w:type="dxa"/>
-            <w:tcMar>
-              <w:top w:w="100" w:type="dxa"/>
-              <w:left w:w="120" w:type="dxa"/>
-              <w:bottom w:w="100" w:type="dxa"/>
-              <w:right w:w="120" w:type="dxa"/>
-            </w:tcMar>
-            <w:vAlign w:val="center"/>
-          </w:tcPr>
-          <w:p>
-            <w:pPr>
-              <w:spacing w:line="260" w:lineRule="auto"/>
-            </w:pPr>
-            <w:r>
-              <w:rPr>
-                <w:color w:val="000000"/>
-                <w:sz w:val="20"/>
-                <w:szCs w:val="20"/>
-              </w:rPr>
-              <w:t>Not started</w:t>
+            <w:tcW w:w="5708" w:type="dxa"/>
+            <w:tcMar>
+              <w:top w:w="100" w:type="dxa"/>
+              <w:left w:w="120" w:type="dxa"/>
+              <w:bottom w:w="100" w:type="dxa"/>
+              <w:right w:w="120" w:type="dxa"/>
+            </w:tcMar>
+            <w:vAlign w:val="center"/>
+          </w:tcPr>
+          <w:p>
+            <w:pPr>
+              <w:spacing w:line="260" w:lineRule="auto"/>
+            </w:pPr>
+            <w:r>
+              <w:rPr>
+                <w:color w:val="000000"/>
+                <w:sz w:val="20"/>
+                <w:szCs w:val="20"/>
+              </w:rPr>
+              <w:t>Build the Admin Management API: an admin can create, update, list, and view details for other admins. Keep the two admin roles — super-admin and admin — and only allow super-admins to use Admin Management.</w:t>
+            </w:r>
+          </w:p>
+        </w:tc>
+        <w:tc>
+          <w:tcPr>
+            <w:tcW w:w="1693" w:type="dxa"/>
+            <w:tcMar>
+              <w:top w:w="100" w:type="dxa"/>
+              <w:left w:w="120" w:type="dxa"/>
+              <w:bottom w:w="100" w:type="dxa"/>
+              <w:right w:w="120" w:type="dxa"/>
+            </w:tcMar>
+            <w:vAlign w:val="center"/>
+          </w:tcPr>
+          <w:p>
+            <w:pPr>
+              <w:spacing w:line="260" w:lineRule="auto"/>
+            </w:pPr>
+          </w:p>
+        </w:tc>
+        <w:tc>
+          <w:tcPr>
+            <w:tcW w:w="1495" w:type="dxa"/>
+            <w:tcMar>
+              <w:top w:w="100" w:type="dxa"/>
+              <w:left w:w="120" w:type="dxa"/>
+              <w:bottom w:w="100" w:type="dxa"/>
+              <w:right w:w="120" w:type="dxa"/>
+            </w:tcMar>
+            <w:vAlign w:val="center"/>
+          </w:tcPr>
+          <w:p>
+            <w:pPr>
+              <w:spacing w:line="260" w:lineRule="auto"/>
+            </w:pPr>
+            <w:r>
+              <w:rPr>
+                <w:color w:val="000000"/>
+                <w:sz w:val="20"/>
+                <w:szCs w:val="20"/>
+              </w:rPr>
+              <w:t>Completed</w:t>
             </w:r>
           </w:p>
         </w:tc>
@@ -13263,77 +13230,74 @@
       <w:tr>
         <w:tc>
           <w:tcPr>
-            <w:tcW w:w="400" w:type="dxa"/>
-            <w:shd w:val="clear" w:color="auto" w:fill="F7F7F7"/>
-            <w:tcMar>
-              <w:top w:w="100" w:type="dxa"/>
-              <w:left w:w="120" w:type="dxa"/>
-              <w:bottom w:w="100" w:type="dxa"/>
-              <w:right w:w="120" w:type="dxa"/>
-            </w:tcMar>
-            <w:vAlign w:val="center"/>
-          </w:tcPr>
-          <w:p>
-            <w:pPr>
-              <w:spacing w:line="260" w:lineRule="auto"/>
-            </w:pPr>
-            <w:r>
-              <w:rPr>
-                <w:color w:val="000000"/>
-                <w:sz w:val="20"/>
-                <w:szCs w:val="20"/>
-              </w:rPr>
+            <w:tcW w:w="464" w:type="dxa"/>
+            <w:shd w:val="clear" w:color="auto" w:fill="F7F7F7"/>
+            <w:tcMar>
+              <w:top w:w="100" w:type="dxa"/>
+              <w:left w:w="120" w:type="dxa"/>
+              <w:bottom w:w="100" w:type="dxa"/>
+              <w:right w:w="120" w:type="dxa"/>
+            </w:tcMar>
+            <w:vAlign w:val="center"/>
+          </w:tcPr>
+          <w:p>
+            <w:pPr>
+              <w:spacing w:line="260" w:lineRule="auto"/>
+            </w:pPr>
+            <w:r>
               <w:t>8</w:t>
             </w:r>
           </w:p>
         </w:tc>
         <w:tc>
           <w:tcPr>
-            <w:tcW w:w="5760" w:type="dxa"/>
-            <w:shd w:val="clear" w:color="auto" w:fill="F7F7F7"/>
-            <w:tcMar>
-              <w:top w:w="100" w:type="dxa"/>
-              <w:left w:w="120" w:type="dxa"/>
-              <w:bottom w:w="100" w:type="dxa"/>
-              <w:right w:w="120" w:type="dxa"/>
-            </w:tcMar>
-            <w:vAlign w:val="center"/>
-          </w:tcPr>
-          <w:p>
-            <w:pPr>
-              <w:spacing w:line="260" w:lineRule="auto"/>
-            </w:pPr>
-            <w:r>
-              <w:rPr>
-                <w:color w:val="000000"/>
-                <w:sz w:val="20"/>
-                <w:szCs w:val="20"/>
-              </w:rPr>
-              <w:t>Review the code, and run smoke tests: approve a seller, moderate a listing, manage a buyer account, create a second admin as a super-admin, process a withdrawal request, and update a banner.</w:t>
-            </w:r>
-          </w:p>
-        </w:tc>
-        <w:tc>
-          <w:tcPr>
-            <w:tcW w:w="1700" w:type="dxa"/>
-            <w:shd w:val="clear" w:color="auto" w:fill="F7F7F7"/>
-            <w:tcMar>
-              <w:top w:w="100" w:type="dxa"/>
-              <w:left w:w="120" w:type="dxa"/>
-              <w:bottom w:w="100" w:type="dxa"/>
-              <w:right w:w="120" w:type="dxa"/>
-            </w:tcMar>
-            <w:vAlign w:val="center"/>
-          </w:tcPr>
-          <w:p>
-            <w:pPr>
-              <w:spacing w:line="260" w:lineRule="auto"/>
-            </w:pPr>
-          </w:p>
-        </w:tc>
-        <w:tc>
-          <w:tcPr>
-            <w:tcW w:w="1500" w:type="dxa"/>
+            <w:tcW w:w="5708" w:type="dxa"/>
+            <w:shd w:val="clear" w:color="auto" w:fill="F7F7F7"/>
+            <w:tcMar>
+              <w:top w:w="100" w:type="dxa"/>
+              <w:left w:w="120" w:type="dxa"/>
+              <w:bottom w:w="100" w:type="dxa"/>
+              <w:right w:w="120" w:type="dxa"/>
+            </w:tcMar>
+            <w:vAlign w:val="center"/>
+          </w:tcPr>
+          <w:p>
+            <w:pPr>
+              <w:spacing w:line="260" w:lineRule="auto"/>
+            </w:pPr>
+            <w:r>
+              <w:rPr>
+                <w:color w:val="000000"/>
+                <w:sz w:val="20"/>
+                <w:szCs w:val="20"/>
+              </w:rPr>
+              <w:t>Build the financial oversight API: reviewing withdrawal requests, refunds, and commission settings.</w:t>
+            </w:r>
+          </w:p>
+        </w:tc>
+        <w:tc>
+          <w:tcPr>
+            <w:tcW w:w="1693" w:type="dxa"/>
+            <w:tcMar>
+              <w:top w:w="100" w:type="dxa"/>
+              <w:left w:w="120" w:type="dxa"/>
+              <w:bottom w:w="100" w:type="dxa"/>
+              <w:right w:w="120" w:type="dxa"/>
+            </w:tcMar>
+            <w:vAlign w:val="center"/>
+          </w:tcPr>
+          <w:p>
+            <w:pPr>
+              <w:spacing w:line="260" w:lineRule="auto"/>
+            </w:pPr>
+            <w:r>
+              <w:t>Postponed — will be done later.</w:t>
+            </w:r>
+          </w:p>
+        </w:tc>
+        <w:tc>
+          <w:tcPr>
+            <w:tcW w:w="1495" w:type="dxa"/>
             <w:shd w:val="clear" w:color="auto" w:fill="F7F7F7"/>
             <w:tcMar>
               <w:top w:w="100" w:type="dxa"/>
@@ -13361,32 +13325,316 @@
       <w:tr>
         <w:tc>
           <w:tcPr>
-            <w:tcW w:w="400" w:type="dxa"/>
-            <w:tcMar>
-              <w:top w:w="100" w:type="dxa"/>
-              <w:left w:w="120" w:type="dxa"/>
-              <w:bottom w:w="100" w:type="dxa"/>
-              <w:right w:w="120" w:type="dxa"/>
-            </w:tcMar>
-            <w:vAlign w:val="center"/>
-          </w:tcPr>
-          <w:p>
-            <w:pPr>
-              <w:spacing w:line="260" w:lineRule="auto"/>
-            </w:pPr>
-            <w:r>
-              <w:rPr>
-                <w:color w:val="000000"/>
-                <w:sz w:val="20"/>
-                <w:szCs w:val="20"/>
-              </w:rPr>
+            <w:tcW w:w="464" w:type="dxa"/>
+            <w:tcMar>
+              <w:top w:w="100" w:type="dxa"/>
+              <w:left w:w="120" w:type="dxa"/>
+              <w:bottom w:w="100" w:type="dxa"/>
+              <w:right w:w="120" w:type="dxa"/>
+            </w:tcMar>
+            <w:vAlign w:val="center"/>
+          </w:tcPr>
+          <w:p>
+            <w:pPr>
+              <w:spacing w:line="260" w:lineRule="auto"/>
+            </w:pPr>
+            <w:r>
               <w:t>9</w:t>
             </w:r>
           </w:p>
         </w:tc>
         <w:tc>
           <w:tcPr>
-            <w:tcW w:w="5760" w:type="dxa"/>
+            <w:tcW w:w="5708" w:type="dxa"/>
+            <w:tcMar>
+              <w:top w:w="100" w:type="dxa"/>
+              <w:left w:w="120" w:type="dxa"/>
+              <w:bottom w:w="100" w:type="dxa"/>
+              <w:right w:w="120" w:type="dxa"/>
+            </w:tcMar>
+            <w:vAlign w:val="center"/>
+          </w:tcPr>
+          <w:p>
+            <w:pPr>
+              <w:spacing w:line="260" w:lineRule="auto"/>
+            </w:pPr>
+            <w:r>
+              <w:rPr>
+                <w:color w:val="000000"/>
+                <w:sz w:val="20"/>
+                <w:szCs w:val="20"/>
+              </w:rPr>
+              <w:t>Build the site settings and CMS API: banners, email templates, and the site logo.</w:t>
+            </w:r>
+          </w:p>
+        </w:tc>
+        <w:tc>
+          <w:tcPr>
+            <w:tcW w:w="1693" w:type="dxa"/>
+            <w:tcMar>
+              <w:top w:w="100" w:type="dxa"/>
+              <w:left w:w="120" w:type="dxa"/>
+              <w:bottom w:w="100" w:type="dxa"/>
+              <w:right w:w="120" w:type="dxa"/>
+            </w:tcMar>
+            <w:vAlign w:val="center"/>
+          </w:tcPr>
+          <w:p>
+            <w:pPr>
+              <w:spacing w:line="260" w:lineRule="auto"/>
+            </w:pPr>
+            <w:r>
+              <w:t xml:space="preserve">Banners, email templates, generic site settings and the site logo. Guide: docs/cms-api-guide.md. </w:t>
+            </w:r>
+            <w:r>
+              <w:lastRenderedPageBreak/>
+              <w:t>Postman: Egoola-CMS.</w:t>
+            </w:r>
+          </w:p>
+        </w:tc>
+        <w:tc>
+          <w:tcPr>
+            <w:tcW w:w="1495" w:type="dxa"/>
+            <w:tcMar>
+              <w:top w:w="100" w:type="dxa"/>
+              <w:left w:w="120" w:type="dxa"/>
+              <w:bottom w:w="100" w:type="dxa"/>
+              <w:right w:w="120" w:type="dxa"/>
+            </w:tcMar>
+            <w:vAlign w:val="center"/>
+          </w:tcPr>
+          <w:p>
+            <w:pPr>
+              <w:spacing w:line="260" w:lineRule="auto"/>
+            </w:pPr>
+            <w:r>
+              <w:rPr>
+                <w:color w:val="000000"/>
+                <w:sz w:val="20"/>
+                <w:szCs w:val="20"/>
+              </w:rPr>
+              <w:lastRenderedPageBreak/>
+              <w:t>Completed</w:t>
+            </w:r>
+          </w:p>
+        </w:tc>
+      </w:tr>
+      <w:tr>
+        <w:tc>
+          <w:tcPr>
+            <w:tcW w:w="464" w:type="dxa"/>
+            <w:shd w:val="clear" w:color="auto" w:fill="F7F7F7"/>
+            <w:tcMar>
+              <w:top w:w="100" w:type="dxa"/>
+              <w:left w:w="120" w:type="dxa"/>
+              <w:bottom w:w="100" w:type="dxa"/>
+              <w:right w:w="120" w:type="dxa"/>
+            </w:tcMar>
+            <w:vAlign w:val="center"/>
+          </w:tcPr>
+          <w:p>
+            <w:pPr>
+              <w:spacing w:line="260" w:lineRule="auto"/>
+            </w:pPr>
+            <w:r>
+              <w:t>10</w:t>
+            </w:r>
+          </w:p>
+        </w:tc>
+        <w:tc>
+          <w:tcPr>
+            <w:tcW w:w="5708" w:type="dxa"/>
+            <w:shd w:val="clear" w:color="auto" w:fill="F7F7F7"/>
+            <w:tcMar>
+              <w:top w:w="100" w:type="dxa"/>
+              <w:left w:w="120" w:type="dxa"/>
+              <w:bottom w:w="100" w:type="dxa"/>
+              <w:right w:w="120" w:type="dxa"/>
+            </w:tcMar>
+            <w:vAlign w:val="center"/>
+          </w:tcPr>
+          <w:p>
+            <w:pPr>
+              <w:spacing w:line="260" w:lineRule="auto"/>
+            </w:pPr>
+            <w:r>
+              <w:rPr>
+                <w:color w:val="000000"/>
+                <w:sz w:val="20"/>
+                <w:szCs w:val="20"/>
+              </w:rPr>
+              <w:t>Review the code, and run smoke tests: approve a seller, moderate a listing, manage a buyer account, create a second admin as a super-admin, process a withdrawal request, and update a banner.</w:t>
+            </w:r>
+          </w:p>
+        </w:tc>
+        <w:tc>
+          <w:tcPr>
+            <w:tcW w:w="1693" w:type="dxa"/>
+            <w:tcMar>
+              <w:top w:w="100" w:type="dxa"/>
+              <w:left w:w="120" w:type="dxa"/>
+              <w:bottom w:w="100" w:type="dxa"/>
+              <w:right w:w="120" w:type="dxa"/>
+            </w:tcMar>
+            <w:vAlign w:val="center"/>
+          </w:tcPr>
+          <w:p>
+            <w:pPr>
+              <w:spacing w:line="260" w:lineRule="auto"/>
+            </w:pPr>
+            <w:r>
+              <w:t>Phase review done: code, docs, Postman collections and the DB Re-Design doc checked against each other and fixed; all smoke suites and every Postman collection pass.</w:t>
+            </w:r>
+          </w:p>
+        </w:tc>
+        <w:tc>
+          <w:tcPr>
+            <w:tcW w:w="1495" w:type="dxa"/>
+            <w:tcMar>
+              <w:top w:w="100" w:type="dxa"/>
+              <w:left w:w="120" w:type="dxa"/>
+              <w:bottom w:w="100" w:type="dxa"/>
+              <w:right w:w="120" w:type="dxa"/>
+            </w:tcMar>
+            <w:vAlign w:val="center"/>
+          </w:tcPr>
+          <w:p>
+            <w:pPr>
+              <w:spacing w:line="260" w:lineRule="auto"/>
+            </w:pPr>
+            <w:r>
+              <w:rPr>
+                <w:color w:val="000000"/>
+                <w:sz w:val="20"/>
+                <w:szCs w:val="20"/>
+              </w:rPr>
+              <w:t>Completed</w:t>
+            </w:r>
+          </w:p>
+        </w:tc>
+      </w:tr>
+      <w:tr>
+        <w:tc>
+          <w:tcPr>
+            <w:tcW w:w="464" w:type="dxa"/>
+            <w:shd w:val="clear" w:color="auto" w:fill="F7F7F7"/>
+            <w:tcMar>
+              <w:top w:w="100" w:type="dxa"/>
+              <w:left w:w="120" w:type="dxa"/>
+              <w:bottom w:w="100" w:type="dxa"/>
+              <w:right w:w="120" w:type="dxa"/>
+            </w:tcMar>
+            <w:vAlign w:val="center"/>
+          </w:tcPr>
+          <w:p>
+            <w:pPr>
+              <w:spacing w:line="260" w:lineRule="auto"/>
+            </w:pPr>
+            <w:r>
+              <w:t>11</w:t>
+            </w:r>
+          </w:p>
+        </w:tc>
+        <w:tc>
+          <w:tcPr>
+            <w:tcW w:w="5708" w:type="dxa"/>
+            <w:shd w:val="clear" w:color="auto" w:fill="F7F7F7"/>
+            <w:tcMar>
+              <w:top w:w="100" w:type="dxa"/>
+              <w:left w:w="120" w:type="dxa"/>
+              <w:bottom w:w="100" w:type="dxa"/>
+              <w:right w:w="120" w:type="dxa"/>
+            </w:tcMar>
+            <w:vAlign w:val="center"/>
+          </w:tcPr>
+          <w:p>
+            <w:pPr>
+              <w:spacing w:line="260" w:lineRule="auto"/>
+            </w:pPr>
+            <w:r>
+              <w:rPr>
+                <w:color w:val="000000"/>
+                <w:sz w:val="20"/>
+                <w:szCs w:val="20"/>
+              </w:rPr>
+              <w:t>Review the code, and run smoke tests: withdrawal</w:t>
+            </w:r>
+          </w:p>
+        </w:tc>
+        <w:tc>
+          <w:tcPr>
+            <w:tcW w:w="1693" w:type="dxa"/>
+            <w:shd w:val="clear" w:color="auto" w:fill="F7F7F7"/>
+            <w:tcMar>
+              <w:top w:w="100" w:type="dxa"/>
+              <w:left w:w="120" w:type="dxa"/>
+              <w:bottom w:w="100" w:type="dxa"/>
+              <w:right w:w="120" w:type="dxa"/>
+            </w:tcMar>
+            <w:vAlign w:val="center"/>
+          </w:tcPr>
+          <w:p>
+            <w:pPr>
+              <w:spacing w:line="260" w:lineRule="auto"/>
+            </w:pPr>
+          </w:p>
+        </w:tc>
+        <w:tc>
+          <w:tcPr>
+            <w:tcW w:w="1495" w:type="dxa"/>
+            <w:shd w:val="clear" w:color="auto" w:fill="F7F7F7"/>
+            <w:tcMar>
+              <w:top w:w="100" w:type="dxa"/>
+              <w:left w:w="120" w:type="dxa"/>
+              <w:bottom w:w="100" w:type="dxa"/>
+              <w:right w:w="120" w:type="dxa"/>
+            </w:tcMar>
+            <w:vAlign w:val="center"/>
+          </w:tcPr>
+          <w:p>
+            <w:pPr>
+              <w:spacing w:line="260" w:lineRule="auto"/>
+              <w:rPr>
+                <w:color w:val="000000"/>
+                <w:sz w:val="20"/>
+                <w:szCs w:val="20"/>
+              </w:rPr>
+            </w:pPr>
+            <w:r>
+              <w:rPr>
+                <w:color w:val="000000"/>
+                <w:sz w:val="20"/>
+                <w:szCs w:val="20"/>
+              </w:rPr>
+              <w:t>Completed</w:t>
+            </w:r>
+          </w:p>
+        </w:tc>
+      </w:tr>
+      <w:tr>
+        <w:tc>
+          <w:tcPr>
+            <w:tcW w:w="464" w:type="dxa"/>
+            <w:tcMar>
+              <w:top w:w="100" w:type="dxa"/>
+              <w:left w:w="120" w:type="dxa"/>
+              <w:bottom w:w="100" w:type="dxa"/>
+              <w:right w:w="120" w:type="dxa"/>
+            </w:tcMar>
+            <w:vAlign w:val="center"/>
+          </w:tcPr>
+          <w:p>
+            <w:pPr>
+              <w:spacing w:line="260" w:lineRule="auto"/>
+            </w:pPr>
+            <w:r>
+              <w:t>11</w:t>
+            </w:r>
+          </w:p>
+        </w:tc>
+        <w:tc>
+          <w:tcPr>
+            <w:tcW w:w="5708" w:type="dxa"/>
             <w:tcMar>
               <w:top w:w="100" w:type="dxa"/>
               <w:left w:w="120" w:type="dxa"/>
@@ -13411,43 +13659,43 @@
         </w:tc>
         <w:tc>
           <w:tcPr>
-            <w:tcW w:w="1700" w:type="dxa"/>
-            <w:tcMar>
-              <w:top w:w="100" w:type="dxa"/>
-              <w:left w:w="120" w:type="dxa"/>
-              <w:bottom w:w="100" w:type="dxa"/>
-              <w:right w:w="120" w:type="dxa"/>
-            </w:tcMar>
-            <w:vAlign w:val="center"/>
-          </w:tcPr>
-          <w:p>
-            <w:pPr>
-              <w:spacing w:line="260" w:lineRule="auto"/>
-            </w:pPr>
-          </w:p>
-        </w:tc>
-        <w:tc>
-          <w:tcPr>
-            <w:tcW w:w="1500" w:type="dxa"/>
-            <w:tcMar>
-              <w:top w:w="100" w:type="dxa"/>
-              <w:left w:w="120" w:type="dxa"/>
-              <w:bottom w:w="100" w:type="dxa"/>
-              <w:right w:w="120" w:type="dxa"/>
-            </w:tcMar>
-            <w:vAlign w:val="center"/>
-          </w:tcPr>
-          <w:p>
-            <w:pPr>
-              <w:spacing w:line="260" w:lineRule="auto"/>
-            </w:pPr>
-            <w:r>
-              <w:rPr>
-                <w:color w:val="000000"/>
-                <w:sz w:val="20"/>
-                <w:szCs w:val="20"/>
-              </w:rPr>
-              <w:t>Not started</w:t>
+            <w:tcW w:w="1693" w:type="dxa"/>
+            <w:tcMar>
+              <w:top w:w="100" w:type="dxa"/>
+              <w:left w:w="120" w:type="dxa"/>
+              <w:bottom w:w="100" w:type="dxa"/>
+              <w:right w:w="120" w:type="dxa"/>
+            </w:tcMar>
+            <w:vAlign w:val="center"/>
+          </w:tcPr>
+          <w:p>
+            <w:pPr>
+              <w:spacing w:line="260" w:lineRule="auto"/>
+            </w:pPr>
+          </w:p>
+        </w:tc>
+        <w:tc>
+          <w:tcPr>
+            <w:tcW w:w="1495" w:type="dxa"/>
+            <w:tcMar>
+              <w:top w:w="100" w:type="dxa"/>
+              <w:left w:w="120" w:type="dxa"/>
+              <w:bottom w:w="100" w:type="dxa"/>
+              <w:right w:w="120" w:type="dxa"/>
+            </w:tcMar>
+            <w:vAlign w:val="center"/>
+          </w:tcPr>
+          <w:p>
+            <w:pPr>
+              <w:spacing w:line="260" w:lineRule="auto"/>
+            </w:pPr>
+            <w:r>
+              <w:rPr>
+                <w:color w:val="000000"/>
+                <w:sz w:val="20"/>
+                <w:szCs w:val="20"/>
+              </w:rPr>
+              <w:t>Completed</w:t>
             </w:r>
           </w:p>
         </w:tc>
@@ -14301,6 +14549,7 @@
                 <w:sz w:val="20"/>
                 <w:szCs w:val="20"/>
               </w:rPr>
+              <w:lastRenderedPageBreak/>
               <w:t>8</w:t>
             </w:r>
           </w:p>
@@ -14590,7 +14839,6 @@
                 <w:sz w:val="20"/>
                 <w:szCs w:val="20"/>
               </w:rPr>
-              <w:lastRenderedPageBreak/>
               <w:t>11</w:t>
             </w:r>
           </w:p>
@@ -15698,6 +15946,7 @@
         <w:spacing w:after="160" w:line="276" w:lineRule="auto"/>
       </w:pPr>
       <w:r>
+        <w:lastRenderedPageBreak/>
         <w:t>A note before the steps below: this list is not fixed. Some of these steps may turn out to be unnecessary and get removed, and many more steps may need to be added, as the work actually happens.</w:t>
       </w:r>
     </w:p>
@@ -15968,7 +16217,6 @@
                 <w:sz w:val="20"/>
                 <w:szCs w:val="20"/>
               </w:rPr>
-              <w:lastRenderedPageBreak/>
               <w:t>2</w:t>
             </w:r>
           </w:p>
@@ -17237,6 +17485,7 @@
                 <w:sz w:val="20"/>
                 <w:szCs w:val="20"/>
               </w:rPr>
+              <w:lastRenderedPageBreak/>
               <w:t>2</w:t>
             </w:r>
           </w:p>
@@ -17526,7 +17775,6 @@
                 <w:sz w:val="20"/>
                 <w:szCs w:val="20"/>
               </w:rPr>
-              <w:lastRenderedPageBreak/>
               <w:t>5</w:t>
             </w:r>
           </w:p>
@@ -18929,6 +19177,7 @@
                 <w:sz w:val="20"/>
                 <w:szCs w:val="20"/>
               </w:rPr>
+              <w:lastRenderedPageBreak/>
               <w:t>9</w:t>
             </w:r>
           </w:p>
@@ -19166,7 +19415,6 @@
                 <w:sz w:val="20"/>
                 <w:szCs w:val="20"/>
               </w:rPr>
-              <w:lastRenderedPageBreak/>
               <w:t>#</w:t>
             </w:r>
           </w:p>
@@ -20386,6 +20634,7 @@
                 <w:sz w:val="20"/>
                 <w:szCs w:val="20"/>
               </w:rPr>
+              <w:lastRenderedPageBreak/>
               <w:t>7</w:t>
             </w:r>
           </w:p>
@@ -20770,7 +21019,6 @@
                 <w:sz w:val="20"/>
                 <w:szCs w:val="20"/>
               </w:rPr>
-              <w:lastRenderedPageBreak/>
               <w:t>11</w:t>
             </w:r>
           </w:p>
@@ -22155,6 +22403,7 @@
                 <w:sz w:val="20"/>
                 <w:szCs w:val="20"/>
               </w:rPr>
+              <w:lastRenderedPageBreak/>
               <w:t>5</w:t>
             </w:r>
           </w:p>
@@ -22539,7 +22788,6 @@
                 <w:sz w:val="20"/>
                 <w:szCs w:val="20"/>
               </w:rPr>
-              <w:lastRenderedPageBreak/>
               <w:t>9</w:t>
             </w:r>
           </w:p>
@@ -23942,6 +24190,7 @@
                 <w:sz w:val="20"/>
                 <w:szCs w:val="20"/>
               </w:rPr>
+              <w:lastRenderedPageBreak/>
               <w:t>11</w:t>
             </w:r>
           </w:p>
@@ -24139,7 +24388,6 @@
         <w:spacing w:after="160" w:line="276" w:lineRule="auto"/>
       </w:pPr>
       <w:r>
-        <w:lastRenderedPageBreak/>
         <w:t>A note before the steps below: this list is not fixed. Some of these steps may turn out to be unnecessary and get removed, and many more steps may need to be added, as the work actually happens.</w:t>
       </w:r>
     </w:p>
@@ -25378,6 +25626,7 @@
                 <w:sz w:val="20"/>
                 <w:szCs w:val="20"/>
               </w:rPr>
+              <w:lastRenderedPageBreak/>
               <w:t>#</w:t>
             </w:r>
           </w:p>
@@ -25823,7 +26072,6 @@
       </w:pPr>
       <w:bookmarkStart w:id="43" w:name="_Toc241224528"/>
       <w:r>
-        <w:lastRenderedPageBreak/>
         <w:t>2.6.5 Buyer Web (Egoola Web)</w:t>
       </w:r>
       <w:bookmarkEnd w:id="43"/>
@@ -26898,6 +27146,7 @@
                 <w:sz w:val="20"/>
                 <w:szCs w:val="20"/>
               </w:rPr>
+              <w:lastRenderedPageBreak/>
               <w:t>5</w:t>
             </w:r>
           </w:p>
@@ -27229,7 +27478,6 @@
                 <w:sz w:val="20"/>
                 <w:szCs w:val="20"/>
               </w:rPr>
-              <w:lastRenderedPageBreak/>
               <w:t>#</w:t>
             </w:r>
           </w:p>
@@ -28516,6 +28764,7 @@
                 <w:sz w:val="20"/>
                 <w:szCs w:val="20"/>
               </w:rPr>
+              <w:lastRenderedPageBreak/>
               <w:t>4</w:t>
             </w:r>
           </w:p>
@@ -29056,7 +29305,6 @@
                 <w:sz w:val="20"/>
                 <w:szCs w:val="20"/>
               </w:rPr>
-              <w:lastRenderedPageBreak/>
               <w:t>4</w:t>
             </w:r>
           </w:p>

</xml_diff>